<commit_message>
docs(quy-uoc): no process runs on a tool's default port
Add section 8 "Quy ước cổng": project port = default + 10000 (API 18000, web 15173,
PostgreSQL 15432, Qdrant 16333, Redis 16379), one *_PORT variable per port in .env,
two documented exceptions (Caddy 80/443 on the VPS; datastores keep default ports
inside the private Docker network), and how to change/add ports.

Co-Authored-By: Claude Opus 5.5 <noreply@anthropic.com>
</commit_message>
<xml_diff>
--- a/docs/export/quy_uoc.docx
+++ b/docs/export/quy_uoc.docx
@@ -457,7 +457,274 @@
               <w:rPr>
                 <w:sz w:val="19"/>
               </w:rPr>
-              <w:t>Phát triển một tính năng hoặc thay đổi riêng, kể cả docs</w:t>
+              <w:t>Phát triển một tính năng hoặc thay đổi riêng</w:t>
+            </w:r>
+          </w:p>
+        </w:tc>
+        <w:tc>
+          <w:tcPr>
+            <w:tcW w:type="dxa" w:w="2340"/>
+          </w:tcPr>
+          <w:p>
+            <w:pPr>
+              <w:spacing w:before="40" w:after="40"/>
+            </w:pPr>
+            <w:r>
+              <w:rPr>
+                <w:sz w:val="19"/>
+              </w:rPr>
+            </w:r>
+            <w:r>
+              <w:rPr>
+                <w:rFonts w:ascii="Consolas" w:hAnsi="Consolas"/>
+                <w:sz w:val="19"/>
+              </w:rPr>
+              <w:t>develop</w:t>
+            </w:r>
+          </w:p>
+        </w:tc>
+        <w:tc>
+          <w:tcPr>
+            <w:tcW w:type="dxa" w:w="2340"/>
+          </w:tcPr>
+          <w:p>
+            <w:pPr>
+              <w:spacing w:before="40" w:after="40"/>
+            </w:pPr>
+            <w:r>
+              <w:rPr>
+                <w:sz w:val="19"/>
+              </w:rPr>
+            </w:r>
+            <w:r>
+              <w:rPr>
+                <w:rFonts w:ascii="Consolas" w:hAnsi="Consolas"/>
+                <w:sz w:val="19"/>
+              </w:rPr>
+              <w:t>develop</w:t>
+            </w:r>
+          </w:p>
+        </w:tc>
+      </w:tr>
+      <w:tr>
+        <w:tc>
+          <w:tcPr>
+            <w:tcW w:type="dxa" w:w="2340"/>
+          </w:tcPr>
+          <w:p>
+            <w:pPr>
+              <w:spacing w:before="40" w:after="40"/>
+            </w:pPr>
+            <w:r>
+              <w:rPr>
+                <w:sz w:val="19"/>
+              </w:rPr>
+            </w:r>
+            <w:r>
+              <w:rPr>
+                <w:rFonts w:ascii="Consolas" w:hAnsi="Consolas"/>
+                <w:sz w:val="19"/>
+              </w:rPr>
+              <w:t>docs/&lt;mã-tác-vụ&gt;-&lt;tên-ngắn-gọn&gt;</w:t>
+            </w:r>
+          </w:p>
+        </w:tc>
+        <w:tc>
+          <w:tcPr>
+            <w:tcW w:type="dxa" w:w="2340"/>
+          </w:tcPr>
+          <w:p>
+            <w:pPr>
+              <w:spacing w:before="40" w:after="40"/>
+            </w:pPr>
+            <w:r>
+              <w:rPr>
+                <w:sz w:val="19"/>
+              </w:rPr>
+            </w:r>
+            <w:r>
+              <w:rPr>
+                <w:sz w:val="19"/>
+              </w:rPr>
+              <w:t>Cập nhật hoặc sửa đổi tài liệu</w:t>
+            </w:r>
+          </w:p>
+        </w:tc>
+        <w:tc>
+          <w:tcPr>
+            <w:tcW w:type="dxa" w:w="2340"/>
+          </w:tcPr>
+          <w:p>
+            <w:pPr>
+              <w:spacing w:before="40" w:after="40"/>
+            </w:pPr>
+            <w:r>
+              <w:rPr>
+                <w:sz w:val="19"/>
+              </w:rPr>
+            </w:r>
+            <w:r>
+              <w:rPr>
+                <w:rFonts w:ascii="Consolas" w:hAnsi="Consolas"/>
+                <w:sz w:val="19"/>
+              </w:rPr>
+              <w:t>develop</w:t>
+            </w:r>
+          </w:p>
+        </w:tc>
+        <w:tc>
+          <w:tcPr>
+            <w:tcW w:type="dxa" w:w="2340"/>
+          </w:tcPr>
+          <w:p>
+            <w:pPr>
+              <w:spacing w:before="40" w:after="40"/>
+            </w:pPr>
+            <w:r>
+              <w:rPr>
+                <w:sz w:val="19"/>
+              </w:rPr>
+            </w:r>
+            <w:r>
+              <w:rPr>
+                <w:rFonts w:ascii="Consolas" w:hAnsi="Consolas"/>
+                <w:sz w:val="19"/>
+              </w:rPr>
+              <w:t>develop</w:t>
+            </w:r>
+          </w:p>
+        </w:tc>
+      </w:tr>
+      <w:tr>
+        <w:tc>
+          <w:tcPr>
+            <w:tcW w:type="dxa" w:w="2340"/>
+          </w:tcPr>
+          <w:p>
+            <w:pPr>
+              <w:spacing w:before="40" w:after="40"/>
+            </w:pPr>
+            <w:r>
+              <w:rPr>
+                <w:sz w:val="19"/>
+              </w:rPr>
+            </w:r>
+            <w:r>
+              <w:rPr>
+                <w:rFonts w:ascii="Consolas" w:hAnsi="Consolas"/>
+                <w:sz w:val="19"/>
+              </w:rPr>
+              <w:t>refactor/&lt;mã-tác-vụ&gt;-&lt;tên-ngắn-gọn&gt;</w:t>
+            </w:r>
+          </w:p>
+        </w:tc>
+        <w:tc>
+          <w:tcPr>
+            <w:tcW w:type="dxa" w:w="2340"/>
+          </w:tcPr>
+          <w:p>
+            <w:pPr>
+              <w:spacing w:before="40" w:after="40"/>
+            </w:pPr>
+            <w:r>
+              <w:rPr>
+                <w:sz w:val="19"/>
+              </w:rPr>
+            </w:r>
+            <w:r>
+              <w:rPr>
+                <w:sz w:val="19"/>
+              </w:rPr>
+              <w:t>Refactor mã nguồn nhưng giữ nguyên hành vi</w:t>
+            </w:r>
+          </w:p>
+        </w:tc>
+        <w:tc>
+          <w:tcPr>
+            <w:tcW w:type="dxa" w:w="2340"/>
+          </w:tcPr>
+          <w:p>
+            <w:pPr>
+              <w:spacing w:before="40" w:after="40"/>
+            </w:pPr>
+            <w:r>
+              <w:rPr>
+                <w:sz w:val="19"/>
+              </w:rPr>
+            </w:r>
+            <w:r>
+              <w:rPr>
+                <w:rFonts w:ascii="Consolas" w:hAnsi="Consolas"/>
+                <w:sz w:val="19"/>
+              </w:rPr>
+              <w:t>develop</w:t>
+            </w:r>
+          </w:p>
+        </w:tc>
+        <w:tc>
+          <w:tcPr>
+            <w:tcW w:type="dxa" w:w="2340"/>
+          </w:tcPr>
+          <w:p>
+            <w:pPr>
+              <w:spacing w:before="40" w:after="40"/>
+            </w:pPr>
+            <w:r>
+              <w:rPr>
+                <w:sz w:val="19"/>
+              </w:rPr>
+            </w:r>
+            <w:r>
+              <w:rPr>
+                <w:rFonts w:ascii="Consolas" w:hAnsi="Consolas"/>
+                <w:sz w:val="19"/>
+              </w:rPr>
+              <w:t>develop</w:t>
+            </w:r>
+          </w:p>
+        </w:tc>
+      </w:tr>
+      <w:tr>
+        <w:tc>
+          <w:tcPr>
+            <w:tcW w:type="dxa" w:w="2340"/>
+          </w:tcPr>
+          <w:p>
+            <w:pPr>
+              <w:spacing w:before="40" w:after="40"/>
+            </w:pPr>
+            <w:r>
+              <w:rPr>
+                <w:sz w:val="19"/>
+              </w:rPr>
+            </w:r>
+            <w:r>
+              <w:rPr>
+                <w:rFonts w:ascii="Consolas" w:hAnsi="Consolas"/>
+                <w:sz w:val="19"/>
+              </w:rPr>
+              <w:t>fix/&lt;mã-tác-vụ&gt;-&lt;tên-ngắn-gọn&gt;</w:t>
+            </w:r>
+          </w:p>
+        </w:tc>
+        <w:tc>
+          <w:tcPr>
+            <w:tcW w:type="dxa" w:w="2340"/>
+          </w:tcPr>
+          <w:p>
+            <w:pPr>
+              <w:spacing w:before="40" w:after="40"/>
+            </w:pPr>
+            <w:r>
+              <w:rPr>
+                <w:sz w:val="19"/>
+              </w:rPr>
+            </w:r>
+            <w:r>
+              <w:rPr>
+                <w:sz w:val="19"/>
+              </w:rPr>
+              <w:t>Sửa lỗi không khẩn cấp</w:t>
             </w:r>
           </w:p>
         </w:tc>
@@ -717,7 +984,7 @@
         <w:spacing w:before="20" w:after="60"/>
       </w:pPr>
       <w:r>
-        <w:t xml:space="preserve">Tên nhánh dùng chữ không dấu, số và dấu gạch nối. Ví dụ: </w:t>
+        <w:t xml:space="preserve">Tên nhánh dùng chữ không dấu, số và dấu gạch nối sau tiền tố. Ví dụ: </w:t>
       </w:r>
       <w:r>
         <w:rPr>
@@ -734,7 +1001,27 @@
           <w:rFonts w:ascii="Consolas" w:hAnsi="Consolas"/>
           <w:sz w:val="19"/>
         </w:rPr>
-        <w:t>feature/docs-01-base-game-scope</w:t>
+        <w:t>docs/docs-01-base-game-scope</w:t>
+      </w:r>
+      <w:r>
+        <w:t xml:space="preserve">, </w:t>
+      </w:r>
+      <w:r>
+        <w:rPr>
+          <w:rFonts w:ascii="Consolas" w:hAnsi="Consolas"/>
+          <w:sz w:val="19"/>
+        </w:rPr>
+        <w:t>refactor/task-2-chat-service</w:t>
+      </w:r>
+      <w:r>
+        <w:t xml:space="preserve">, </w:t>
+      </w:r>
+      <w:r>
+        <w:rPr>
+          <w:rFonts w:ascii="Consolas" w:hAnsi="Consolas"/>
+          <w:sz w:val="19"/>
+        </w:rPr>
+        <w:t>fix/bug-12-chat-timeout</w:t>
       </w:r>
       <w:r>
         <w:t xml:space="preserve">, </w:t>
@@ -754,7 +1041,7 @@
           <w:rFonts w:ascii="Consolas" w:hAnsi="Consolas"/>
           <w:sz w:val="19"/>
         </w:rPr>
-        <w:t>hotfix/bug-12-chat-timeout</w:t>
+        <w:t>hotfix/bug-13-chat-timeout</w:t>
       </w:r>
       <w:r>
         <w:t xml:space="preserve">. Không dùng các tiền tố </w:t>
@@ -767,14 +1054,24 @@
         <w:t>feat/</w:t>
       </w:r>
       <w:r>
-        <w:t xml:space="preserve">, </w:t>
+        <w:t xml:space="preserve"> hoặc </w:t>
       </w:r>
       <w:r>
         <w:rPr>
           <w:rFonts w:ascii="Consolas" w:hAnsi="Consolas"/>
           <w:sz w:val="19"/>
         </w:rPr>
-        <w:t>fix/</w:t>
+        <w:t>chore/</w:t>
+      </w:r>
+      <w:r>
+        <w:t xml:space="preserve"> làm loại nhánh; những tên này có thể là loại commit. Mọi nhánh công việc đều phải được tạo từ nhánh nền phù hợp và được push lên nhánh riêng, không push trực tiếp lên </w:t>
+      </w:r>
+      <w:r>
+        <w:rPr>
+          <w:rFonts w:ascii="Consolas" w:hAnsi="Consolas"/>
+          <w:sz w:val="19"/>
+        </w:rPr>
+        <w:t>main</w:t>
       </w:r>
       <w:r>
         <w:t xml:space="preserve">, </w:t>
@@ -784,20 +1081,20 @@
           <w:rFonts w:ascii="Consolas" w:hAnsi="Consolas"/>
           <w:sz w:val="19"/>
         </w:rPr>
-        <w:t>docs/</w:t>
+        <w:t>master</w:t>
       </w:r>
       <w:r>
-        <w:t xml:space="preserve">, </w:t>
+        <w:t xml:space="preserve"> hoặc </w:t>
       </w:r>
       <w:r>
         <w:rPr>
           <w:rFonts w:ascii="Consolas" w:hAnsi="Consolas"/>
           <w:sz w:val="19"/>
         </w:rPr>
-        <w:t>chore/</w:t>
+        <w:t>develop</w:t>
       </w:r>
       <w:r>
-        <w:t xml:space="preserve"> thay cho các loại nhánh trên; những tên này có thể là loại commit.</w:t>
+        <w:t>.</w:t>
       </w:r>
     </w:p>
     <w:p>
@@ -813,7 +1110,47 @@
         <w:pStyle w:val="ListNumber"/>
       </w:pPr>
       <w:r>
-        <w:t xml:space="preserve">Đồng bộ remote và tạo feature từ </w:t>
+        <w:t>Đồng bộ remote và tạo nhánh công việc phù hợp (</w:t>
+      </w:r>
+      <w:r>
+        <w:rPr>
+          <w:rFonts w:ascii="Consolas" w:hAnsi="Consolas"/>
+          <w:sz w:val="19"/>
+        </w:rPr>
+        <w:t>feature/*</w:t>
+      </w:r>
+      <w:r>
+        <w:t xml:space="preserve">, </w:t>
+      </w:r>
+      <w:r>
+        <w:rPr>
+          <w:rFonts w:ascii="Consolas" w:hAnsi="Consolas"/>
+          <w:sz w:val="19"/>
+        </w:rPr>
+        <w:t>docs/*</w:t>
+      </w:r>
+      <w:r>
+        <w:t xml:space="preserve">, </w:t>
+      </w:r>
+      <w:r>
+        <w:rPr>
+          <w:rFonts w:ascii="Consolas" w:hAnsi="Consolas"/>
+          <w:sz w:val="19"/>
+        </w:rPr>
+        <w:t>refactor/*</w:t>
+      </w:r>
+      <w:r>
+        <w:t xml:space="preserve"> hoặc </w:t>
+      </w:r>
+      <w:r>
+        <w:rPr>
+          <w:rFonts w:ascii="Consolas" w:hAnsi="Consolas"/>
+          <w:sz w:val="19"/>
+        </w:rPr>
+        <w:t>fix/*</w:t>
+      </w:r>
+      <w:r>
+        <w:t xml:space="preserve">) từ </w:t>
       </w:r>
       <w:r>
         <w:rPr>
@@ -857,7 +1194,7 @@
         <w:pStyle w:val="ListNumber"/>
       </w:pPr>
       <w:r>
-        <w:t xml:space="preserve">Push nhánh feature và mở PR có </w:t>
+        <w:t xml:space="preserve">Push nhánh công việc và mở PR có </w:t>
       </w:r>
       <w:r>
         <w:rPr>
@@ -1016,6 +1353,54 @@
       </w:r>
       <w:r>
         <w:t>. Các commit trong ví dụ minh họa vòng đời đều phải tuân theo quy trình PR này.</w:t>
+      </w:r>
+    </w:p>
+    <w:p>
+      <w:pPr>
+        <w:spacing w:before="20" w:after="60"/>
+      </w:pPr>
+      <w:r>
+        <w:t xml:space="preserve">Tác vụ chỉ cập nhật tài liệu dùng </w:t>
+      </w:r>
+      <w:r>
+        <w:rPr>
+          <w:rFonts w:ascii="Consolas" w:hAnsi="Consolas"/>
+          <w:sz w:val="19"/>
+        </w:rPr>
+        <w:t>docs/*</w:t>
+      </w:r>
+      <w:r>
+        <w:t xml:space="preserve">; tác vụ refactor dùng </w:t>
+      </w:r>
+      <w:r>
+        <w:rPr>
+          <w:rFonts w:ascii="Consolas" w:hAnsi="Consolas"/>
+          <w:sz w:val="19"/>
+        </w:rPr>
+        <w:t>refactor/*</w:t>
+      </w:r>
+      <w:r>
+        <w:t xml:space="preserve">; tác vụ sửa lỗi thông thường dùng </w:t>
+      </w:r>
+      <w:r>
+        <w:rPr>
+          <w:rFonts w:ascii="Consolas" w:hAnsi="Consolas"/>
+          <w:sz w:val="19"/>
+        </w:rPr>
+        <w:t>fix/*</w:t>
+      </w:r>
+      <w:r>
+        <w:t xml:space="preserve">. Các nhánh này vẫn phải mở PR về </w:t>
+      </w:r>
+      <w:r>
+        <w:rPr>
+          <w:rFonts w:ascii="Consolas" w:hAnsi="Consolas"/>
+          <w:sz w:val="19"/>
+        </w:rPr>
+        <w:t>develop</w:t>
+      </w:r>
+      <w:r>
+        <w:t>, tuân thủ review và không được dùng để bypass quy trình.</w:t>
       </w:r>
     </w:p>
     <w:p>
@@ -2322,6 +2707,798 @@
         <w:t>. Không sửa riêng bản sprint được sinh tự động. Cập nhật Trello là thao tác riêng; sinh tài liệu không đồng nghĩa board đã được cập nhật.</w:t>
       </w:r>
     </w:p>
+    <w:p>
+      <w:pPr>
+        <w:pStyle w:val="Heading1"/>
+      </w:pPr>
+      <w:r>
+        <w:t>8. Quy ước cổng</w:t>
+      </w:r>
+    </w:p>
+    <w:p>
+      <w:pPr>
+        <w:spacing w:before="20" w:after="60"/>
+      </w:pPr>
+      <w:r>
+        <w:rPr>
+          <w:b/>
+        </w:rPr>
+        <w:t>Mọi tiến trình của dự án không chạy trên cổng mặc định của công cụ.</w:t>
+      </w:r>
+      <w:r>
+        <w:t xml:space="preserve"> Cổng dự án = </w:t>
+      </w:r>
+      <w:r>
+        <w:rPr>
+          <w:b/>
+        </w:rPr>
+        <w:t>cổng gốc + 10000</w:t>
+      </w:r>
+      <w:r>
+        <w:t>: dễ nhớ, không đụng PostgreSQL/Redis/dev server khác đang chạy trên máy, và tránh các lượt quét tự động nhắm vào cổng mặc định.</w:t>
+      </w:r>
+    </w:p>
+    <w:tbl>
+      <w:tblPr>
+        <w:tblStyle w:val="TableGrid"/>
+        <w:tblW w:type="auto" w:w="0"/>
+        <w:tblLook w:firstColumn="1" w:firstRow="1" w:lastColumn="0" w:lastRow="0" w:noHBand="0" w:noVBand="1" w:val="04A0"/>
+      </w:tblPr>
+      <w:tblGrid>
+        <w:gridCol w:w="2340"/>
+        <w:gridCol w:w="2340"/>
+        <w:gridCol w:w="2340"/>
+        <w:gridCol w:w="2340"/>
+      </w:tblGrid>
+      <w:tr>
+        <w:tc>
+          <w:tcPr>
+            <w:tcW w:type="dxa" w:w="2340"/>
+            <w:shd w:val="clear" w:color="auto" w:fill="D9C48A"/>
+          </w:tcPr>
+          <w:p>
+            <w:pPr>
+              <w:spacing w:before="60" w:after="60"/>
+            </w:pPr>
+            <w:r>
+              <w:rPr>
+                <w:b/>
+                <w:sz w:val="19"/>
+              </w:rPr>
+            </w:r>
+            <w:r>
+              <w:rPr>
+                <w:b/>
+                <w:sz w:val="19"/>
+              </w:rPr>
+              <w:t>Tiến trình</w:t>
+            </w:r>
+          </w:p>
+        </w:tc>
+        <w:tc>
+          <w:tcPr>
+            <w:tcW w:type="dxa" w:w="2340"/>
+            <w:shd w:val="clear" w:color="auto" w:fill="D9C48A"/>
+          </w:tcPr>
+          <w:p>
+            <w:pPr>
+              <w:spacing w:before="60" w:after="60"/>
+            </w:pPr>
+            <w:r>
+              <w:rPr>
+                <w:b/>
+                <w:sz w:val="19"/>
+              </w:rPr>
+            </w:r>
+            <w:r>
+              <w:rPr>
+                <w:b/>
+                <w:sz w:val="19"/>
+              </w:rPr>
+              <w:t>Cổng mặc định</w:t>
+            </w:r>
+          </w:p>
+        </w:tc>
+        <w:tc>
+          <w:tcPr>
+            <w:tcW w:type="dxa" w:w="2340"/>
+            <w:shd w:val="clear" w:color="auto" w:fill="D9C48A"/>
+          </w:tcPr>
+          <w:p>
+            <w:pPr>
+              <w:spacing w:before="60" w:after="60"/>
+            </w:pPr>
+            <w:r>
+              <w:rPr>
+                <w:b/>
+                <w:sz w:val="19"/>
+              </w:rPr>
+            </w:r>
+            <w:r>
+              <w:rPr>
+                <w:b/>
+                <w:sz w:val="19"/>
+              </w:rPr>
+              <w:t>Cổng dự án</w:t>
+            </w:r>
+          </w:p>
+        </w:tc>
+        <w:tc>
+          <w:tcPr>
+            <w:tcW w:type="dxa" w:w="2340"/>
+            <w:shd w:val="clear" w:color="auto" w:fill="D9C48A"/>
+          </w:tcPr>
+          <w:p>
+            <w:pPr>
+              <w:spacing w:before="60" w:after="60"/>
+            </w:pPr>
+            <w:r>
+              <w:rPr>
+                <w:b/>
+                <w:sz w:val="19"/>
+              </w:rPr>
+            </w:r>
+            <w:r>
+              <w:rPr>
+                <w:b/>
+                <w:sz w:val="19"/>
+              </w:rPr>
+              <w:t xml:space="preserve">Biến trong </w:t>
+            </w:r>
+            <w:r>
+              <w:rPr>
+                <w:rFonts w:ascii="Consolas" w:hAnsi="Consolas"/>
+                <w:b/>
+                <w:sz w:val="19"/>
+              </w:rPr>
+              <w:t>.env</w:t>
+            </w:r>
+          </w:p>
+        </w:tc>
+      </w:tr>
+      <w:tr>
+        <w:tc>
+          <w:tcPr>
+            <w:tcW w:type="dxa" w:w="2340"/>
+          </w:tcPr>
+          <w:p>
+            <w:pPr>
+              <w:spacing w:before="40" w:after="40"/>
+            </w:pPr>
+            <w:r>
+              <w:rPr>
+                <w:sz w:val="19"/>
+              </w:rPr>
+            </w:r>
+            <w:r>
+              <w:rPr>
+                <w:sz w:val="19"/>
+              </w:rPr>
+              <w:t>API (uvicorn) — local và trong container</w:t>
+            </w:r>
+          </w:p>
+        </w:tc>
+        <w:tc>
+          <w:tcPr>
+            <w:tcW w:type="dxa" w:w="2340"/>
+          </w:tcPr>
+          <w:p>
+            <w:pPr>
+              <w:spacing w:before="40" w:after="40"/>
+            </w:pPr>
+            <w:r>
+              <w:rPr>
+                <w:sz w:val="19"/>
+              </w:rPr>
+            </w:r>
+            <w:r>
+              <w:rPr>
+                <w:sz w:val="19"/>
+              </w:rPr>
+              <w:t>8000</w:t>
+            </w:r>
+          </w:p>
+        </w:tc>
+        <w:tc>
+          <w:tcPr>
+            <w:tcW w:type="dxa" w:w="2340"/>
+          </w:tcPr>
+          <w:p>
+            <w:pPr>
+              <w:spacing w:before="40" w:after="40"/>
+            </w:pPr>
+            <w:r>
+              <w:rPr>
+                <w:sz w:val="19"/>
+              </w:rPr>
+            </w:r>
+            <w:r>
+              <w:rPr>
+                <w:b/>
+                <w:sz w:val="19"/>
+              </w:rPr>
+              <w:t>18000</w:t>
+            </w:r>
+          </w:p>
+        </w:tc>
+        <w:tc>
+          <w:tcPr>
+            <w:tcW w:type="dxa" w:w="2340"/>
+          </w:tcPr>
+          <w:p>
+            <w:pPr>
+              <w:spacing w:before="40" w:after="40"/>
+            </w:pPr>
+            <w:r>
+              <w:rPr>
+                <w:sz w:val="19"/>
+              </w:rPr>
+            </w:r>
+            <w:r>
+              <w:rPr>
+                <w:rFonts w:ascii="Consolas" w:hAnsi="Consolas"/>
+                <w:sz w:val="19"/>
+              </w:rPr>
+              <w:t>API_PORT</w:t>
+            </w:r>
+            <w:r>
+              <w:rPr>
+                <w:sz w:val="19"/>
+              </w:rPr>
+              <w:t xml:space="preserve"> (local)</w:t>
+            </w:r>
+          </w:p>
+        </w:tc>
+      </w:tr>
+      <w:tr>
+        <w:tc>
+          <w:tcPr>
+            <w:tcW w:type="dxa" w:w="2340"/>
+          </w:tcPr>
+          <w:p>
+            <w:pPr>
+              <w:spacing w:before="40" w:after="40"/>
+            </w:pPr>
+            <w:r>
+              <w:rPr>
+                <w:sz w:val="19"/>
+              </w:rPr>
+            </w:r>
+            <w:r>
+              <w:rPr>
+                <w:sz w:val="19"/>
+              </w:rPr>
+              <w:t>Web (Vite dev server)</w:t>
+            </w:r>
+          </w:p>
+        </w:tc>
+        <w:tc>
+          <w:tcPr>
+            <w:tcW w:type="dxa" w:w="2340"/>
+          </w:tcPr>
+          <w:p>
+            <w:pPr>
+              <w:spacing w:before="40" w:after="40"/>
+            </w:pPr>
+            <w:r>
+              <w:rPr>
+                <w:sz w:val="19"/>
+              </w:rPr>
+            </w:r>
+            <w:r>
+              <w:rPr>
+                <w:sz w:val="19"/>
+              </w:rPr>
+              <w:t>5173</w:t>
+            </w:r>
+          </w:p>
+        </w:tc>
+        <w:tc>
+          <w:tcPr>
+            <w:tcW w:type="dxa" w:w="2340"/>
+          </w:tcPr>
+          <w:p>
+            <w:pPr>
+              <w:spacing w:before="40" w:after="40"/>
+            </w:pPr>
+            <w:r>
+              <w:rPr>
+                <w:sz w:val="19"/>
+              </w:rPr>
+            </w:r>
+            <w:r>
+              <w:rPr>
+                <w:b/>
+                <w:sz w:val="19"/>
+              </w:rPr>
+              <w:t>15173</w:t>
+            </w:r>
+          </w:p>
+        </w:tc>
+        <w:tc>
+          <w:tcPr>
+            <w:tcW w:type="dxa" w:w="2340"/>
+          </w:tcPr>
+          <w:p>
+            <w:pPr>
+              <w:spacing w:before="40" w:after="40"/>
+            </w:pPr>
+            <w:r>
+              <w:rPr>
+                <w:sz w:val="19"/>
+              </w:rPr>
+            </w:r>
+            <w:r>
+              <w:rPr>
+                <w:rFonts w:ascii="Consolas" w:hAnsi="Consolas"/>
+                <w:sz w:val="19"/>
+              </w:rPr>
+              <w:t>WEB_PORT</w:t>
+            </w:r>
+          </w:p>
+        </w:tc>
+      </w:tr>
+      <w:tr>
+        <w:tc>
+          <w:tcPr>
+            <w:tcW w:type="dxa" w:w="2340"/>
+          </w:tcPr>
+          <w:p>
+            <w:pPr>
+              <w:spacing w:before="40" w:after="40"/>
+            </w:pPr>
+            <w:r>
+              <w:rPr>
+                <w:sz w:val="19"/>
+              </w:rPr>
+            </w:r>
+            <w:r>
+              <w:rPr>
+                <w:sz w:val="19"/>
+              </w:rPr>
+              <w:t>PostgreSQL (cổng mở trên máy)</w:t>
+            </w:r>
+          </w:p>
+        </w:tc>
+        <w:tc>
+          <w:tcPr>
+            <w:tcW w:type="dxa" w:w="2340"/>
+          </w:tcPr>
+          <w:p>
+            <w:pPr>
+              <w:spacing w:before="40" w:after="40"/>
+            </w:pPr>
+            <w:r>
+              <w:rPr>
+                <w:sz w:val="19"/>
+              </w:rPr>
+            </w:r>
+            <w:r>
+              <w:rPr>
+                <w:sz w:val="19"/>
+              </w:rPr>
+              <w:t>5432</w:t>
+            </w:r>
+          </w:p>
+        </w:tc>
+        <w:tc>
+          <w:tcPr>
+            <w:tcW w:type="dxa" w:w="2340"/>
+          </w:tcPr>
+          <w:p>
+            <w:pPr>
+              <w:spacing w:before="40" w:after="40"/>
+            </w:pPr>
+            <w:r>
+              <w:rPr>
+                <w:sz w:val="19"/>
+              </w:rPr>
+            </w:r>
+            <w:r>
+              <w:rPr>
+                <w:b/>
+                <w:sz w:val="19"/>
+              </w:rPr>
+              <w:t>15432</w:t>
+            </w:r>
+          </w:p>
+        </w:tc>
+        <w:tc>
+          <w:tcPr>
+            <w:tcW w:type="dxa" w:w="2340"/>
+          </w:tcPr>
+          <w:p>
+            <w:pPr>
+              <w:spacing w:before="40" w:after="40"/>
+            </w:pPr>
+            <w:r>
+              <w:rPr>
+                <w:sz w:val="19"/>
+              </w:rPr>
+            </w:r>
+            <w:r>
+              <w:rPr>
+                <w:rFonts w:ascii="Consolas" w:hAnsi="Consolas"/>
+                <w:sz w:val="19"/>
+              </w:rPr>
+              <w:t>POSTGRES_PORT</w:t>
+            </w:r>
+          </w:p>
+        </w:tc>
+      </w:tr>
+      <w:tr>
+        <w:tc>
+          <w:tcPr>
+            <w:tcW w:type="dxa" w:w="2340"/>
+          </w:tcPr>
+          <w:p>
+            <w:pPr>
+              <w:spacing w:before="40" w:after="40"/>
+            </w:pPr>
+            <w:r>
+              <w:rPr>
+                <w:sz w:val="19"/>
+              </w:rPr>
+            </w:r>
+            <w:r>
+              <w:rPr>
+                <w:sz w:val="19"/>
+              </w:rPr>
+              <w:t>Qdrant HTTP (cổng mở trên máy)</w:t>
+            </w:r>
+          </w:p>
+        </w:tc>
+        <w:tc>
+          <w:tcPr>
+            <w:tcW w:type="dxa" w:w="2340"/>
+          </w:tcPr>
+          <w:p>
+            <w:pPr>
+              <w:spacing w:before="40" w:after="40"/>
+            </w:pPr>
+            <w:r>
+              <w:rPr>
+                <w:sz w:val="19"/>
+              </w:rPr>
+            </w:r>
+            <w:r>
+              <w:rPr>
+                <w:sz w:val="19"/>
+              </w:rPr>
+              <w:t>6333</w:t>
+            </w:r>
+          </w:p>
+        </w:tc>
+        <w:tc>
+          <w:tcPr>
+            <w:tcW w:type="dxa" w:w="2340"/>
+          </w:tcPr>
+          <w:p>
+            <w:pPr>
+              <w:spacing w:before="40" w:after="40"/>
+            </w:pPr>
+            <w:r>
+              <w:rPr>
+                <w:sz w:val="19"/>
+              </w:rPr>
+            </w:r>
+            <w:r>
+              <w:rPr>
+                <w:b/>
+                <w:sz w:val="19"/>
+              </w:rPr>
+              <w:t>16333</w:t>
+            </w:r>
+          </w:p>
+        </w:tc>
+        <w:tc>
+          <w:tcPr>
+            <w:tcW w:type="dxa" w:w="2340"/>
+          </w:tcPr>
+          <w:p>
+            <w:pPr>
+              <w:spacing w:before="40" w:after="40"/>
+            </w:pPr>
+            <w:r>
+              <w:rPr>
+                <w:sz w:val="19"/>
+              </w:rPr>
+            </w:r>
+            <w:r>
+              <w:rPr>
+                <w:rFonts w:ascii="Consolas" w:hAnsi="Consolas"/>
+                <w:sz w:val="19"/>
+              </w:rPr>
+              <w:t>QDRANT_PORT</w:t>
+            </w:r>
+          </w:p>
+        </w:tc>
+      </w:tr>
+      <w:tr>
+        <w:tc>
+          <w:tcPr>
+            <w:tcW w:type="dxa" w:w="2340"/>
+          </w:tcPr>
+          <w:p>
+            <w:pPr>
+              <w:spacing w:before="40" w:after="40"/>
+            </w:pPr>
+            <w:r>
+              <w:rPr>
+                <w:sz w:val="19"/>
+              </w:rPr>
+            </w:r>
+            <w:r>
+              <w:rPr>
+                <w:sz w:val="19"/>
+              </w:rPr>
+              <w:t>Redis (cổng mở trên máy)</w:t>
+            </w:r>
+          </w:p>
+        </w:tc>
+        <w:tc>
+          <w:tcPr>
+            <w:tcW w:type="dxa" w:w="2340"/>
+          </w:tcPr>
+          <w:p>
+            <w:pPr>
+              <w:spacing w:before="40" w:after="40"/>
+            </w:pPr>
+            <w:r>
+              <w:rPr>
+                <w:sz w:val="19"/>
+              </w:rPr>
+            </w:r>
+            <w:r>
+              <w:rPr>
+                <w:sz w:val="19"/>
+              </w:rPr>
+              <w:t>6379</w:t>
+            </w:r>
+          </w:p>
+        </w:tc>
+        <w:tc>
+          <w:tcPr>
+            <w:tcW w:type="dxa" w:w="2340"/>
+          </w:tcPr>
+          <w:p>
+            <w:pPr>
+              <w:spacing w:before="40" w:after="40"/>
+            </w:pPr>
+            <w:r>
+              <w:rPr>
+                <w:sz w:val="19"/>
+              </w:rPr>
+            </w:r>
+            <w:r>
+              <w:rPr>
+                <w:b/>
+                <w:sz w:val="19"/>
+              </w:rPr>
+              <w:t>16379</w:t>
+            </w:r>
+          </w:p>
+        </w:tc>
+        <w:tc>
+          <w:tcPr>
+            <w:tcW w:type="dxa" w:w="2340"/>
+          </w:tcPr>
+          <w:p>
+            <w:pPr>
+              <w:spacing w:before="40" w:after="40"/>
+            </w:pPr>
+            <w:r>
+              <w:rPr>
+                <w:sz w:val="19"/>
+              </w:rPr>
+            </w:r>
+            <w:r>
+              <w:rPr>
+                <w:rFonts w:ascii="Consolas" w:hAnsi="Consolas"/>
+                <w:sz w:val="19"/>
+              </w:rPr>
+              <w:t>REDIS_PORT</w:t>
+            </w:r>
+          </w:p>
+        </w:tc>
+      </w:tr>
+    </w:tbl>
+    <w:p/>
+    <w:p>
+      <w:pPr>
+        <w:spacing w:before="20" w:after="60"/>
+      </w:pPr>
+      <w:r>
+        <w:t>Ngoại lệ (chỉ hai trường hợp, phải ghi chú tại chỗ):</w:t>
+      </w:r>
+    </w:p>
+    <w:p>
+      <w:pPr>
+        <w:pStyle w:val="ListNumber"/>
+      </w:pPr>
+      <w:r>
+        <w:rPr>
+          <w:b/>
+        </w:rPr>
+        <w:t>Caddy trên VPS dùng 80/443</w:t>
+      </w:r>
+      <w:r>
+        <w:t>: trình duyệt và Let's Encrypt (cấp HTTPS) bắt buộc dùng cổng chuẩn.</w:t>
+      </w:r>
+    </w:p>
+    <w:p>
+      <w:pPr>
+        <w:pStyle w:val="ListNumber"/>
+      </w:pPr>
+      <w:r>
+        <w:rPr>
+          <w:b/>
+        </w:rPr>
+        <w:t>PostgreSQL, Redis, Qdrant giữ cổng gốc bên trong mạng Docker riêng</w:t>
+      </w:r>
+      <w:r>
+        <w:t xml:space="preserve"> (</w:t>
+      </w:r>
+      <w:r>
+        <w:rPr>
+          <w:rFonts w:ascii="Consolas" w:hAnsi="Consolas"/>
+          <w:sz w:val="19"/>
+        </w:rPr>
+        <w:t>postgres:5432</w:t>
+      </w:r>
+      <w:r>
+        <w:t xml:space="preserve">, </w:t>
+      </w:r>
+      <w:r>
+        <w:rPr>
+          <w:rFonts w:ascii="Consolas" w:hAnsi="Consolas"/>
+          <w:sz w:val="19"/>
+        </w:rPr>
+        <w:t>redis:6379</w:t>
+      </w:r>
+      <w:r>
+        <w:t xml:space="preserve">, </w:t>
+      </w:r>
+      <w:r>
+        <w:rPr>
+          <w:rFonts w:ascii="Consolas" w:hAnsi="Consolas"/>
+          <w:sz w:val="19"/>
+        </w:rPr>
+        <w:t>qdrant:6333</w:t>
+      </w:r>
+      <w:r>
+        <w:t>): không mở ra ngoài, không ai chạm tới ngoài các container của dự án; service container của GitHub Actions cũng không cho đổi cổng này. Cổng phía máy vẫn theo bảng trên.</w:t>
+      </w:r>
+    </w:p>
+    <w:p>
+      <w:pPr>
+        <w:spacing w:before="20" w:after="60"/>
+      </w:pPr>
+      <w:r>
+        <w:t>Quy tắc khi làm việc:</w:t>
+      </w:r>
+    </w:p>
+    <w:p>
+      <w:pPr>
+        <w:pStyle w:val="ListBullet"/>
+      </w:pPr>
+      <w:r>
+        <w:t xml:space="preserve">Mỗi cổng khai báo ở **một biến </w:t>
+      </w:r>
+      <w:r>
+        <w:rPr>
+          <w:rFonts w:ascii="Consolas" w:hAnsi="Consolas"/>
+          <w:sz w:val="19"/>
+        </w:rPr>
+        <w:t>*_PORT</w:t>
+      </w:r>
+      <w:r>
+        <w:t xml:space="preserve"> duy nhất** trong </w:t>
+      </w:r>
+      <w:r>
+        <w:rPr>
+          <w:rFonts w:ascii="Consolas" w:hAnsi="Consolas"/>
+          <w:sz w:val="19"/>
+        </w:rPr>
+        <w:t>.env</w:t>
+      </w:r>
+      <w:r>
+        <w:t>; docker compose, backend, Makefile, Vite, bot cùng đọc biến đó. Không ghi cứng số cổng trong code, script, tài liệu hướng dẫn chạy.</w:t>
+      </w:r>
+    </w:p>
+    <w:p>
+      <w:pPr>
+        <w:pStyle w:val="ListBullet"/>
+      </w:pPr>
+      <w:r>
+        <w:t xml:space="preserve">Cổng bị chiếm trên máy mình: đổi biến trong </w:t>
+      </w:r>
+      <w:r>
+        <w:rPr>
+          <w:rFonts w:ascii="Consolas" w:hAnsi="Consolas"/>
+          <w:sz w:val="19"/>
+        </w:rPr>
+        <w:t>.env</w:t>
+      </w:r>
+      <w:r>
+        <w:t xml:space="preserve"> của mình (vd. </w:t>
+      </w:r>
+      <w:r>
+        <w:rPr>
+          <w:rFonts w:ascii="Consolas" w:hAnsi="Consolas"/>
+          <w:sz w:val="19"/>
+        </w:rPr>
+        <w:t>API_PORT=18001</w:t>
+      </w:r>
+      <w:r>
+        <w:t xml:space="preserve">), </w:t>
+      </w:r>
+      <w:r>
+        <w:rPr>
+          <w:b/>
+        </w:rPr>
+        <w:t>không</w:t>
+      </w:r>
+      <w:r>
+        <w:t xml:space="preserve"> sửa file của dự án.</w:t>
+      </w:r>
+    </w:p>
+    <w:p>
+      <w:pPr>
+        <w:pStyle w:val="ListBullet"/>
+      </w:pPr>
+      <w:r>
+        <w:t xml:space="preserve">Thêm tiến trình mới: chọn cổng gốc + 10000, thêm vào bảng trên, </w:t>
+      </w:r>
+      <w:r>
+        <w:rPr>
+          <w:rFonts w:ascii="Consolas" w:hAnsi="Consolas"/>
+          <w:sz w:val="19"/>
+        </w:rPr>
+        <w:t>.env.example</w:t>
+      </w:r>
+      <w:r>
+        <w:t xml:space="preserve">, và test </w:t>
+      </w:r>
+      <w:r>
+        <w:rPr>
+          <w:rFonts w:ascii="Consolas" w:hAnsi="Consolas"/>
+          <w:sz w:val="19"/>
+        </w:rPr>
+        <w:t>backend/tests/unit/test_ports.py</w:t>
+      </w:r>
+      <w:r>
+        <w:t>.</w:t>
+      </w:r>
+    </w:p>
+    <w:p>
+      <w:pPr>
+        <w:pStyle w:val="ListBullet"/>
+      </w:pPr>
+      <w:r>
+        <w:t xml:space="preserve">Dev chỉ bind </w:t>
+      </w:r>
+      <w:r>
+        <w:rPr>
+          <w:rFonts w:ascii="Consolas" w:hAnsi="Consolas"/>
+          <w:sz w:val="19"/>
+        </w:rPr>
+        <w:t>127.0.0.1</w:t>
+      </w:r>
+      <w:r>
+        <w:t xml:space="preserve">. Không chạy với </w:t>
+      </w:r>
+      <w:r>
+        <w:rPr>
+          <w:rFonts w:ascii="Consolas" w:hAnsi="Consolas"/>
+          <w:sz w:val="19"/>
+        </w:rPr>
+        <w:t>--host 0.0.0.0</w:t>
+      </w:r>
+      <w:r>
+        <w:t xml:space="preserve"> (mở cho cả mạng LAN).</w:t>
+      </w:r>
+    </w:p>
     <w:sectPr>
       <w:pgSz w:w="12240" w:h="15840"/>
       <w:pgMar w:top="1440" w:right="1440" w:bottom="1440" w:left="1440" w:header="720" w:footer="720" w:gutter="0"/>

</xml_diff>